<commit_message>
docs(sync): clarify recovery validation status
</commit_message>
<xml_diff>
--- a/jackyun-portal/docs/sync-v5-full-data-recovery-progress-3.53.1-20261028.docx
+++ b/jackyun-portal/docs/sync-v5-full-data-recovery-progress-3.53.1-20261028.docx
@@ -334,17 +334,17 @@
     </w:p>
     <w:p>
       <w:r>
-        <w:t xml:space="preserve">本轮恢复/v5 客户端、备份中心和版本历史专项套件在 3.53.0 通过 49/49；3.53.1 新增同步状态回归：持久恢复目标阻止误报 synced、计入待处理并继续保留。目标测试文件 workspace-sync-recovery.test.mts 需在本提交复跑。此前 TypeScript、定向 ESLint、Next.js webpack 生产构建通过；本次状态修改后将重新复跑。全量 test:sync 在本机高并发执行长时间无进展输出后中断，不能标成完整通过；CI 中独立 Existing data safety regressions 则为成功。合成 200 KB Schedule 测试中，单条 CUE 修改请求正文约 526 B，无变化同步正文为 0 B；这是模拟 API/IndexedDB 结果，不是生产实测。</w:t>
-      </w:r>
-    </w:p>
-    <w:p>
-      <w:r>
-        <w:t xml:space="preserve">新增网络失败分类测试通过 2 项，覆盖瞬态状态码与主动 AbortError。针对 PR #168 的浏览器 UI 回归，多个失败在 origin/main 基线可复现，归为已有历史失败；StudyGuide 状态测试在基线通过而当前分支的一次独立本地复测失败，但本地 standalone 认证夹具没有加载 iframe，测试环境无效，不能把它认定为新回归或通过。GitHub UI 流程需要在修复/对齐的 CI 夹具中再次对照。</w:t>
-      </w:r>
-    </w:p>
-    <w:p>
-      <w:r>
-        <w:t xml:space="preserve">本次 PR #169 head a529a70 的 GitHub Actions 结果：生产构建、TypeScript/ESLint 与 Existing data safety regressions 均通过；Run production UI flows 失败。日志列出 active-legacy-ui（诗词 iframe 主题等待）、study-guide-state（iframe 标签等待）、music-player-state（测试歌曲未出现）、answer-sheet-legacy（保存标题为空）、cue-route-draft 与 cue-search（移动 Schedule 按钮不可见）、review-queue（完成标题超时）。当前找不到同 SHA origin/main 基线 workflow 来核实这些失败是否为既有问题，故分类为“同步安全门外的 UI 流程失败、基线归因未证实”，不是全部通过，也不阻断已通过的专项同步数据安全测试。4.0.0 前应补同提交基线对照并修复任何新增回归。</w:t>
+        <w:t xml:space="preserve">恢复/v5 客户端、备份中心、版本历史及同步协调专项套件现为 63/63；包括 3.53.1 回归：持久恢复目标阻止误报 synced、计入待处理并继续保留。TypeScript、定向 ESLint 和 Next.js webpack 生产构建通过。全量 test:sync 在本机高并发执行长时间无进展输出后中断，不能标成完整通过；此前 CI 独立 Existing data safety regressions 为成功。合成 200 KB Schedule 测试中，单条 CUE 修改请求正文约 526 B，无变化同步正文为 0 B；这是模拟 API/IndexedDB 结果，不是生产实测。</w:t>
+      </w:r>
+    </w:p>
+    <w:p>
+      <w:r>
+        <w:t xml:space="preserve">新增网络失败分类测试通过 2 项，覆盖瞬态状态码与主动 AbortError。针对 PR #168 的浏览器 UI 回归，现有失败日志包含 active-legacy-ui（诗词 iframe 主题等待）、study-guide-state（iframe 标签等待）、music-player-state（测试歌曲未出现）、answer-sheet-legacy（保存标题为空）、cue-route-draft 与 cue-search（移动 Schedule 按钮不可见）、review-queue（完成标题超时）。当前没有同 SHA origin/main 基线 workflow 证据，不能确认这些是历史基线或新增回归，分类为“UI 流程失败、基线归因未证实”；同步安全测试单独统计，不跳过任何数据安全检查。</w:t>
+      </w:r>
+    </w:p>
+    <w:p>
+      <w:r>
+        <w:t xml:space="preserve">PR #169 最新 head 3b26c9d 的 CI 状态仍在运行。Vercel Preview 对应 SHA 3b26c9d 已完成本地及云端编译/类型检查/静态生成日志，但部署 API 仍报告 BUILDING，必须等状态转为 READY 后再做预览健康核验。旧 head a529a70 上生产构建、TypeScript/ESLint 与 Existing data safety regressions 曾通过；其 Run production UI flows 失败，不能外推为当前 head 通过或失败。</w:t>
       </w:r>
     </w:p>
     <w:p>

</xml_diff>